<commit_message>
Fix duplicate reference + add consumer product patent claims
- Remove duplicate Walløe reference (was refs 5 and 8, now unified as ref 5)
- Renumber all citations after removal (now 29 refs, no gaps, no orphans)
- Add Diller patent citation in Hypothesis section
- Patent: add claims 10-12 for consumer product (末梢保温デバイス)
- Patent: add implementation example 3 (民生品版グローブ)
- Patent: add staged upgrade strategy (consumer → medical device)

Co-Authored-By: Tatsuki Onishi <bougtoir@gmail.com>
</commit_message>
<xml_diff>
--- a/ava_lllt_hypothesis/manuscript_medical_hypotheses.docx
+++ b/ava_lllt_hypothesis/manuscript_medical_hypotheses.docx
@@ -200,7 +200,7 @@
           <w:sz w:val="16"/>
           <w:vertAlign w:val="superscript"/>
         </w:rPr>
-        <w:t>8</w:t>
+        <w:t>5</w:t>
       </w:r>
       <w:r>
         <w:rPr>
@@ -213,7 +213,7 @@
           <w:sz w:val="16"/>
           <w:vertAlign w:val="superscript"/>
         </w:rPr>
-        <w:t>9</w:t>
+        <w:t>8</w:t>
       </w:r>
       <w:r>
         <w:rPr>
@@ -234,7 +234,7 @@
           <w:sz w:val="16"/>
           <w:vertAlign w:val="superscript"/>
         </w:rPr>
-        <w:t>10</w:t>
+        <w:t>9</w:t>
       </w:r>
       <w:r>
         <w:rPr>
@@ -247,7 +247,7 @@
           <w:sz w:val="16"/>
           <w:vertAlign w:val="superscript"/>
         </w:rPr>
-        <w:t>11</w:t>
+        <w:t>10</w:t>
       </w:r>
       <w:r>
         <w:rPr>
@@ -260,7 +260,7 @@
           <w:sz w:val="16"/>
           <w:vertAlign w:val="superscript"/>
         </w:rPr>
-        <w:t>12</w:t>
+        <w:t>11</w:t>
       </w:r>
       <w:r>
         <w:rPr>
@@ -273,7 +273,7 @@
           <w:sz w:val="16"/>
           <w:vertAlign w:val="superscript"/>
         </w:rPr>
-        <w:t>13</w:t>
+        <w:t>12</w:t>
       </w:r>
       <w:r>
         <w:rPr>
@@ -321,7 +321,7 @@
           <w:sz w:val="16"/>
           <w:vertAlign w:val="superscript"/>
         </w:rPr>
-        <w:t>14</w:t>
+        <w:t>13</w:t>
       </w:r>
       <w:r>
         <w:rPr>
@@ -347,7 +347,7 @@
           <w:sz w:val="16"/>
           <w:vertAlign w:val="superscript"/>
         </w:rPr>
-        <w:t>11,13</w:t>
+        <w:t>10,12</w:t>
       </w:r>
       <w:r>
         <w:rPr>
@@ -360,7 +360,7 @@
           <w:sz w:val="16"/>
           <w:vertAlign w:val="superscript"/>
         </w:rPr>
-        <w:t>12</w:t>
+        <w:t>11</w:t>
       </w:r>
       <w:r>
         <w:rPr>
@@ -373,7 +373,7 @@
           <w:sz w:val="16"/>
           <w:vertAlign w:val="superscript"/>
         </w:rPr>
-        <w:t>8</w:t>
+        <w:t>5</w:t>
       </w:r>
       <w:r>
         <w:rPr>
@@ -386,7 +386,7 @@
           <w:sz w:val="16"/>
           <w:vertAlign w:val="superscript"/>
         </w:rPr>
-        <w:t>15</w:t>
+        <w:t>14</w:t>
       </w:r>
       <w:r>
         <w:rPr>
@@ -400,14 +400,27 @@
         <w:rPr>
           <w:sz w:val="22"/>
         </w:rPr>
-        <w:t>This mechanism is fundamentally distinct from the thermal vasodilation employed by existing devices (e.g., AVACEN, which uses conductive heating plus negative pressure).</w:t>
+        <w:t>This mechanism is fundamentally distinct from the thermal vasodilation employed by existing devices (e.g., AVACEN, which uses conductive heating plus negative pressure,</w:t>
       </w:r>
       <w:r>
         <w:rPr>
           <w:sz w:val="16"/>
           <w:vertAlign w:val="superscript"/>
         </w:rPr>
-        <w:t>16</w:t>
+        <w:t>15</w:t>
+      </w:r>
+      <w:r>
+        <w:rPr>
+          <w:sz w:val="22"/>
+        </w:rPr>
+        <w:t xml:space="preserve"> and the selective thermal stimulation system of Diller et al., which targets spinal thermoregulatory centers during sleep).</w:t>
+      </w:r>
+      <w:r>
+        <w:rPr>
+          <w:sz w:val="16"/>
+          <w:vertAlign w:val="superscript"/>
+        </w:rPr>
+        <w:t>29</w:t>
       </w:r>
       <w:r>
         <w:rPr>
@@ -498,7 +511,7 @@
           <w:sz w:val="16"/>
           <w:vertAlign w:val="superscript"/>
         </w:rPr>
-        <w:t>9,17</w:t>
+        <w:t>8,16</w:t>
       </w:r>
       <w:r>
         <w:rPr>
@@ -511,7 +524,7 @@
           <w:sz w:val="16"/>
           <w:vertAlign w:val="superscript"/>
         </w:rPr>
-        <w:t>18</w:t>
+        <w:t>17</w:t>
       </w:r>
       <w:r>
         <w:rPr>
@@ -533,7 +546,7 @@
           <w:sz w:val="16"/>
           <w:vertAlign w:val="superscript"/>
         </w:rPr>
-        <w:t>13</w:t>
+        <w:t>12</w:t>
       </w:r>
       <w:r>
         <w:rPr>
@@ -546,7 +559,7 @@
           <w:sz w:val="16"/>
           <w:vertAlign w:val="superscript"/>
         </w:rPr>
-        <w:t>19</w:t>
+        <w:t>18</w:t>
       </w:r>
       <w:r>
         <w:rPr>
@@ -559,7 +572,7 @@
           <w:sz w:val="16"/>
           <w:vertAlign w:val="superscript"/>
         </w:rPr>
-        <w:t>20</w:t>
+        <w:t>19</w:t>
       </w:r>
       <w:r>
         <w:rPr>
@@ -580,7 +593,7 @@
           <w:sz w:val="16"/>
           <w:vertAlign w:val="superscript"/>
         </w:rPr>
-        <w:t>8</w:t>
+        <w:t>5</w:t>
       </w:r>
       <w:r>
         <w:rPr>
@@ -593,7 +606,7 @@
           <w:sz w:val="16"/>
           <w:vertAlign w:val="superscript"/>
         </w:rPr>
-        <w:t>21,22</w:t>
+        <w:t>20,21</w:t>
       </w:r>
       <w:r>
         <w:rPr>
@@ -606,7 +619,7 @@
           <w:sz w:val="16"/>
           <w:vertAlign w:val="superscript"/>
         </w:rPr>
-        <w:t>23</w:t>
+        <w:t>22</w:t>
       </w:r>
       <w:r>
         <w:rPr>
@@ -640,7 +653,7 @@
           <w:sz w:val="16"/>
           <w:vertAlign w:val="superscript"/>
         </w:rPr>
-        <w:t>23</w:t>
+        <w:t>22</w:t>
       </w:r>
       <w:r>
         <w:rPr>
@@ -653,7 +666,7 @@
           <w:sz w:val="16"/>
           <w:vertAlign w:val="superscript"/>
         </w:rPr>
-        <w:t>24</w:t>
+        <w:t>23</w:t>
       </w:r>
       <w:r>
         <w:rPr>
@@ -666,7 +679,7 @@
           <w:sz w:val="16"/>
           <w:vertAlign w:val="superscript"/>
         </w:rPr>
-        <w:t>25</w:t>
+        <w:t>24</w:t>
       </w:r>
       <w:r>
         <w:rPr>
@@ -901,7 +914,7 @@
                 <w:sz w:val="18"/>
                 <w:vertAlign w:val="superscript"/>
               </w:rPr>
-              <w:t>9</w:t>
+              <w:t>8</w:t>
             </w:r>
             <w:r>
               <w:rPr>
@@ -1030,7 +1043,7 @@
                 <w:sz w:val="18"/>
                 <w:vertAlign w:val="superscript"/>
               </w:rPr>
-              <w:t>16</w:t>
+              <w:t>15</w:t>
             </w:r>
             <w:r>
               <w:rPr>
@@ -1161,7 +1174,7 @@
                 <w:sz w:val="18"/>
                 <w:vertAlign w:val="superscript"/>
               </w:rPr>
-              <w:t>29</w:t>
+              <w:t>28</w:t>
             </w:r>
             <w:r>
               <w:rPr>
@@ -1365,7 +1378,7 @@
           <w:sz w:val="16"/>
           <w:vertAlign w:val="superscript"/>
         </w:rPr>
-        <w:t>26</w:t>
+        <w:t>25</w:t>
       </w:r>
       <w:r>
         <w:rPr>
@@ -1378,7 +1391,7 @@
           <w:sz w:val="16"/>
           <w:vertAlign w:val="superscript"/>
         </w:rPr>
-        <w:t>27</w:t>
+        <w:t>26</w:t>
       </w:r>
       <w:r>
         <w:rPr>
@@ -1421,7 +1434,7 @@
           <w:sz w:val="16"/>
           <w:vertAlign w:val="superscript"/>
         </w:rPr>
-        <w:t>28</w:t>
+        <w:t>27</w:t>
       </w:r>
       <w:r>
         <w:rPr>
@@ -1442,7 +1455,7 @@
           <w:sz w:val="16"/>
           <w:vertAlign w:val="superscript"/>
         </w:rPr>
-        <w:t>20</w:t>
+        <w:t>19</w:t>
       </w:r>
       <w:r>
         <w:rPr>
@@ -1583,7 +1596,7 @@
         <w:rPr>
           <w:sz w:val="18"/>
         </w:rPr>
-        <w:t>Walløe L. Arterio-venous anastomoses in the human skin and their role in temperature control. Temperature (Austin). 2016;3(1):92-103.</w:t>
+        <w:t>Lobo MD, Sobotka PA, Stanton A, et al. Central arteriovenous anastomosis for the treatment of patients with uncontrolled hypertension (the ROX CONTROL HTN study): a randomised controlled trial. Lancet. 2015;385(9978):1634-1641.</w:t>
       </w:r>
     </w:p>
     <w:p>
@@ -1597,7 +1610,7 @@
         <w:rPr>
           <w:sz w:val="18"/>
         </w:rPr>
-        <w:t>Lobo MD, Sobotka PA, Stanton A, et al. Central arteriovenous anastomosis for the treatment of patients with uncontrolled hypertension (the ROX CONTROL HTN study): a randomised controlled trial. Lancet. 2015;385(9978):1634-1641.</w:t>
+        <w:t>Anders JJ, Lanzafame RJ, Arany PR. Low-level light/laser therapy versus photobiomodulation therapy. Photomed Laser Surg. 2015;33(4):183-184.</w:t>
       </w:r>
     </w:p>
     <w:p>
@@ -1611,7 +1624,7 @@
         <w:rPr>
           <w:sz w:val="18"/>
         </w:rPr>
-        <w:t>Anders JJ, Lanzafame RJ, Arany PR. Low-level light/laser therapy versus photobiomodulation therapy. Photomed Laser Surg. 2015;33(4):183-184.</w:t>
+        <w:t>Karu TI, Pyatibrat LV, Afanasyeva NI. Cellular effects of low power laser therapy can be mediated by nitric oxide. Lasers Surg Med. 2005;36(4):307-314.</w:t>
       </w:r>
     </w:p>
     <w:p>
@@ -1625,7 +1638,7 @@
         <w:rPr>
           <w:sz w:val="18"/>
         </w:rPr>
-        <w:t>Karu TI, Pyatibrat LV, Afanasyeva NI. Cellular effects of low power laser therapy can be mediated by nitric oxide. Lasers Surg Med. 2005;36(4):307-314.</w:t>
+        <w:t>Moncada S, Higgs EA. The discovery of nitric oxide and its role in vascular biology. Br J Pharmacol. 2006;147(S1):S193-S201.</w:t>
       </w:r>
     </w:p>
     <w:p>
@@ -1639,7 +1652,7 @@
         <w:rPr>
           <w:sz w:val="18"/>
         </w:rPr>
-        <w:t>Moncada S, Higgs EA. The discovery of nitric oxide and its role in vascular biology. Br J Pharmacol. 2006;147(S1):S193-S201.</w:t>
+        <w:t>Ribeiro BG, Alves AN, Dos Santos LA, et al. Nitric oxide storage levels modulate vasodilation and the hypotensive effect induced by photobiomodulation using an AlGaAs diode laser (660 nm). Lasers Med Sci. 2022;37(6):2551-2559.</w:t>
       </w:r>
     </w:p>
     <w:p>
@@ -1653,7 +1666,7 @@
         <w:rPr>
           <w:sz w:val="18"/>
         </w:rPr>
-        <w:t>Ribeiro BG, Alves AN, Dos Santos LA, et al. Nitric oxide storage levels modulate vasodilation and the hypotensive effect induced by photobiomodulation using an AlGaAs diode laser (660 nm). Lasers Med Sci. 2022;37(6):2551-2559.</w:t>
+        <w:t>De Freitas Rodrigues A, Sordillo LA, Sordillo PP, et al. In vivo attenuation profile of 660 nm and 830 nm wavelengths on human skin. Lasers Med Sci. 2024;39(1):28.</w:t>
       </w:r>
     </w:p>
     <w:p>
@@ -1667,7 +1680,7 @@
         <w:rPr>
           <w:sz w:val="18"/>
         </w:rPr>
-        <w:t>De Freitas Rodrigues A, Sordillo LA, Sordillo PP, et al. In vivo attenuation profile of 660 nm and 830 nm wavelengths on human skin. Lasers Med Sci. 2024;39(1):28.</w:t>
+        <w:t>Lewington S, Clarke R, Qizilbash N, et al. Age-specific relevance of usual blood pressure to vascular mortality. Lancet. 2002;360(9349):1903-1913.</w:t>
       </w:r>
     </w:p>
     <w:p>
@@ -1681,7 +1694,7 @@
         <w:rPr>
           <w:sz w:val="18"/>
         </w:rPr>
-        <w:t>Lewington S, Clarke R, Qizilbash N, et al. Age-specific relevance of usual blood pressure to vascular mortality. Lancet. 2002;360(9349):1903-1913.</w:t>
+        <w:t>AVACEN Medical. AVACEN 100 Treatment System. US Patent 8,679,170 B2. 2014.</w:t>
       </w:r>
     </w:p>
     <w:p>
@@ -1695,7 +1708,7 @@
         <w:rPr>
           <w:sz w:val="18"/>
         </w:rPr>
-        <w:t>AVACEN Medical. AVACEN 100 Treatment System. US Patent 8,679,170 B2. 2014.</w:t>
+        <w:t>Lobo MD, Ott C, Gane EJ, et al. Central iliac arteriovenous anastomosis for uncontrolled hypertension: one-year results from the ROX CONTROL HTN trial. Hypertension. 2017;70(6):1099-1105.</w:t>
       </w:r>
     </w:p>
     <w:p>
@@ -1709,7 +1722,7 @@
         <w:rPr>
           <w:sz w:val="18"/>
         </w:rPr>
-        <w:t>Lobo MD, Ott C, Gane EJ, et al. Central iliac arteriovenous anastomosis for uncontrolled hypertension: one-year results from the ROX CONTROL HTN trial. Hypertension. 2017;70(6):1099-1105.</w:t>
+        <w:t>Faul JL, Galindo J, Engelsgjerd JS, et al. Creation of an iliac arteriovenous shunt lowers blood pressure in chronic obstructive pulmonary disease patients with hypertension. J Vasc Surg. 2014;59(4):1078-1083.</w:t>
       </w:r>
     </w:p>
     <w:p>
@@ -1723,7 +1736,7 @@
         <w:rPr>
           <w:sz w:val="18"/>
         </w:rPr>
-        <w:t>Faul JL, Galindo J, Engelsgjerd JS, et al. Creation of an iliac arteriovenous shunt lowers blood pressure in chronic obstructive pulmonary disease patients with hypertension. J Vasc Surg. 2014;59(4):1078-1083.</w:t>
+        <w:t>Damasceno GM, Pfaff AMCS, Gomes RSA, et al. Photobiomodulation therapy in hypertension management—Evidence from a systematic review and meta-analysis. J Clin Med. 2025;14(19):6716.</w:t>
       </w:r>
     </w:p>
     <w:p>
@@ -1737,7 +1750,7 @@
         <w:rPr>
           <w:sz w:val="18"/>
         </w:rPr>
-        <w:t>Damasceno GM, Pfaff AMCS, Gomes RSA, et al. Photobiomodulation therapy in hypertension management—Evidence from a systematic review and meta-analysis. J Clin Med. 2025;14(19):6716.</w:t>
+        <w:t>Rogatkin DA, Dunaev AV. Stimulation of blood microcirculation at low level laser irradiation. Proc SPIE. 2014;9129:912922.</w:t>
       </w:r>
     </w:p>
     <w:p>
@@ -1751,7 +1764,7 @@
         <w:rPr>
           <w:sz w:val="18"/>
         </w:rPr>
-        <w:t>Rogatkin DA, Dunaev AV. Stimulation of blood microcirculation at low level laser irradiation. Proc SPIE. 2014;9129:912922.</w:t>
+        <w:t>Kräuchi K, Gompper B, Hauenstein D, et al. Diurnal blood pressure variations are associated with changes in distal-proximal skin temperature gradient. Chronobiol Int. 2012;29(9):1189-1197.</w:t>
       </w:r>
     </w:p>
     <w:p>
@@ -1765,7 +1778,7 @@
         <w:rPr>
           <w:sz w:val="18"/>
         </w:rPr>
-        <w:t>Kräuchi K, Gompper B, Hauenstein D, et al. Diurnal blood pressure variations are associated with changes in distal-proximal skin temperature gradient. Chronobiol Int. 2012;29(9):1189-1197.</w:t>
+        <w:t>Martinez-Nicolas A, Ortiz-Tudela E, Rol MA, et al. Wrist skin temperature, motor activity, and body position as determinants of the circadian pattern of blood pressure. Chronobiol Int. 2013;30(5):668-678.</w:t>
       </w:r>
     </w:p>
     <w:p>
@@ -1779,7 +1792,7 @@
         <w:rPr>
           <w:sz w:val="18"/>
         </w:rPr>
-        <w:t>Martinez-Nicolas A, Ortiz-Tudela E, Rol MA, et al. Wrist skin temperature, motor activity, and body position as determinants of the circadian pattern of blood pressure. Chronobiol Int. 2013;30(5):668-678.</w:t>
+        <w:t>Gani F, Guzman RC, Ahmed SS, et al. Local passive heat for the treatment of hypertension in autonomic failure. J Am Heart Assoc. 2021;10(13):e018979.</w:t>
       </w:r>
     </w:p>
     <w:p>
@@ -1793,7 +1806,7 @@
         <w:rPr>
           <w:sz w:val="18"/>
         </w:rPr>
-        <w:t>Gani F, Guzman RC, Ahmed SS, et al. Local passive heat for the treatment of hypertension in autonomic failure. J Am Heart Assoc. 2021;10(13):e018979.</w:t>
+        <w:t>Ferraresi C, Huang YY, Hamblin MR. Photobiomodulation in human muscle tissue: an advantage in sports performance? J Biophotonics. 2016;9(11-12):1273-1299.</w:t>
       </w:r>
     </w:p>
     <w:p>
@@ -1807,7 +1820,7 @@
         <w:rPr>
           <w:sz w:val="18"/>
         </w:rPr>
-        <w:t>Ferraresi C, Huang YY, Hamblin MR. Photobiomodulation in human muscle tissue: an advantage in sports performance? J Biophotonics. 2016;9(11-12):1273-1299.</w:t>
+        <w:t>Grassi G, Ram VS. Evidence for a critical role of the sympathetic nervous system in hypertension. J Am Soc Hypertens. 2016;10(5):457-466.</w:t>
       </w:r>
     </w:p>
     <w:p>
@@ -1821,7 +1834,7 @@
         <w:rPr>
           <w:sz w:val="18"/>
         </w:rPr>
-        <w:t>Grassi G, Ram VS. Evidence for a critical role of the sympathetic nervous system in hypertension. J Am Soc Hypertens. 2016;10(5):457-466.</w:t>
+        <w:t>Modesti PA. Season, temperature and blood pressure: a complex interaction. Eur J Intern Med. 2013;24(7):604-607.</w:t>
       </w:r>
     </w:p>
     <w:p>
@@ -1835,7 +1848,7 @@
         <w:rPr>
           <w:sz w:val="18"/>
         </w:rPr>
-        <w:t>Modesti PA. Season, temperature and blood pressure: a complex interaction. Eur J Intern Med. 2013;24(7):604-607.</w:t>
+        <w:t>Barnett AG, Sans S, Salomaa V, et al. The effect of temperature on systolic blood pressure. Blood Press Monit. 2007;12(3):195-203.</w:t>
       </w:r>
     </w:p>
     <w:p>
@@ -1849,7 +1862,7 @@
         <w:rPr>
           <w:sz w:val="18"/>
         </w:rPr>
-        <w:t>Barnett AG, Sans S, Salomaa V, et al. The effect of temperature on systolic blood pressure. Blood Press Monit. 2007;12(3):195-203.</w:t>
+        <w:t>Flavahan NA. A vascular mechanistic approach to understanding Raynaud phenomenon. Nat Rev Rheumatol. 2015;11(3):146-158.</w:t>
       </w:r>
     </w:p>
     <w:p>
@@ -1863,7 +1876,7 @@
         <w:rPr>
           <w:sz w:val="18"/>
         </w:rPr>
-        <w:t>Flavahan NA. A vascular mechanistic approach to understanding Raynaud phenomenon. Nat Rev Rheumatol. 2015;11(3):146-158.</w:t>
+        <w:t>Haghayegh S, Khoshnevis S, Smolensky MH, et al. Novel temperature-controlled sleep system to improve sleep: a proof-of-concept study. J Sleep Res. 2022;31(5):e13662.</w:t>
       </w:r>
     </w:p>
     <w:p>
@@ -1877,35 +1890,7 @@
         <w:rPr>
           <w:sz w:val="18"/>
         </w:rPr>
-        <w:t>Haghayegh S, Khoshnevis S, Smolensky MH, et al. Novel temperature-controlled sleep system to improve sleep: a proof-of-concept study. J Sleep Res. 2022;31(5):e13662.</w:t>
-      </w:r>
-    </w:p>
-    <w:p>
-      <w:r>
-        <w:rPr>
-          <w:sz w:val="18"/>
-        </w:rPr>
-        <w:t xml:space="preserve">30. </w:t>
-      </w:r>
-      <w:r>
-        <w:rPr>
-          <w:sz w:val="18"/>
-        </w:rPr>
         <w:t>Diller KR, Khoshnevis S, Hemmen L. Thermoregulatory manipulation of systemic blood pressure. US Patent 11,229,548 B2. 2022.</w:t>
-      </w:r>
-    </w:p>
-    <w:p>
-      <w:r>
-        <w:rPr>
-          <w:sz w:val="18"/>
-        </w:rPr>
-        <w:t xml:space="preserve">31. </w:t>
-      </w:r>
-      <w:r>
-        <w:rPr>
-          <w:sz w:val="18"/>
-        </w:rPr>
-        <w:t>Eriksen M, Walløe L. Thermoregulatory fluctuations in heart rate and blood pressure in humans: effect of cooling and parasympathetic blockade. J Auton Nerv Syst. 1994;47(3):245-254.</w:t>
       </w:r>
     </w:p>
     <w:sectPr>

</xml_diff>